<commit_message>
Finaliza calendarios de agosto e automacao Youze da Camila Sartori
Calendarios de Instagram e WhatsApp de agosto (2 posts/semana, carrosseis
narrativos em vez de quiz SIM/NAO, plano de automacao intercalando venda
direta do curso e convite para a Comunidade AME-SE). Adiciona o plano de
automacao (qual gatilho leva pra curso vs comunidade) e as mensagens
prontas da automacao Youze (sequencia de venda com botao de interacao +
sequencia de convite pra comunidade).

Co-Authored-By: Claude Sonnet 5 <noreply@anthropic.com>
</commit_message>
<xml_diff>
--- a/camila-sartori/calendario-fonte/calendario-instagram-agosto.docx
+++ b/camila-sartori/calendario-fonte/calendario-instagram-agosto.docx
@@ -299,7 +299,7 @@
                 <w:color w:val="FFFFFF"/>
                 <w:sz w:val="21"/>
               </w:rPr>
-              <w:t>📅  07/08 (SEX), Carrossel</w:t>
+              <w:t>📅  07/08 (SEX), Carrossel narrativo</w:t>
             </w:r>
           </w:p>
         </w:tc>
@@ -342,7 +342,7 @@
                 <w:color w:val="FFFFFF"/>
                 <w:sz w:val="20"/>
               </w:rPr>
-              <w:t>⏰ 09h   [ INSTAGRAM ]   💬 VALOR + ENGAJAMENTO (Automação -&gt; Grupo VIP)</w:t>
+              <w:t>⏰ 09h   [ INSTAGRAM ]   💰 VENDA (Automação -&gt; Curso, ver plano de automação)</w:t>
             </w:r>
           </w:p>
         </w:tc>
@@ -382,7 +382,7 @@
                 <w:i w:val="0"/>
                 <w:sz w:val="18"/>
               </w:rPr>
-              <w:t>Carrossel (7 cards)</w:t>
+              <w:t>Carrossel (7 cards, narrativo)</w:t>
             </w:r>
           </w:p>
           <w:p>
@@ -422,7 +422,7 @@
                 <w:i w:val="0"/>
                 <w:sz w:val="19"/>
               </w:rPr>
-              <w:t>Marca SIM ou NÃO. Se bater 3 ou mais, isso também é sobre você.</w:t>
+              <w:t>Ela terminou o projeto duas semanas antes do prazo. Revisado três vezes. E mesmo assim, não conseguiu comemorar.</w:t>
             </w:r>
             <w:r>
               <w:br/>
@@ -441,7 +441,7 @@
                 <w:i w:val="0"/>
                 <w:sz w:val="19"/>
               </w:rPr>
-              <w:t>Arrasta para o lado e vai contando.</w:t>
+              <w:t>Arrasta para o lado.</w:t>
             </w:r>
           </w:p>
           <w:p>
@@ -473,7 +473,7 @@
                 <w:i w:val="0"/>
                 <w:sz w:val="19"/>
               </w:rPr>
-              <w:t>SIM ou NÃO: você refaz um texto ou e-mail várias vezes antes de enviar, mesmo já estando bom?</w:t>
+              <w:t>Porque um detalhe pequeno, que ninguém além dela ia notar, ainda incomodava. E aquele detalhe apagava, na cabeça dela, tudo que tinha dado certo.</w:t>
             </w:r>
           </w:p>
           <w:p>
@@ -505,7 +505,7 @@
                 <w:i w:val="0"/>
                 <w:sz w:val="19"/>
               </w:rPr>
-              <w:t>SIM ou NÃO: você sente que um erro pequeno apaga dez acertos grandes?</w:t>
+              <w:t>Isso não é raro. Muita gente vive assim: mede o próprio valor pelo que ainda falta, nunca pelo que já foi construído.</w:t>
             </w:r>
           </w:p>
           <w:p>
@@ -537,7 +537,7 @@
                 <w:i w:val="0"/>
                 <w:sz w:val="19"/>
               </w:rPr>
-              <w:t>SIM ou NÃO: você evita começar algo se não tiver certeza de que vai fazer perfeito?</w:t>
+              <w:t>E o medo de errar às vezes pesa tanto, que fica mais fácil nem começar do que começar e não fazer perfeito.</w:t>
             </w:r>
           </w:p>
           <w:p>
@@ -569,7 +569,7 @@
                 <w:i w:val="0"/>
                 <w:sz w:val="19"/>
               </w:rPr>
-              <w:t>SIM ou NÃO: você compara os seus bastidores com o resultado pronto dos outros?</w:t>
+              <w:t>Só que perfeccionismo não é sinônimo de excelência. Na maioria das vezes, é medo de julgamento com roupa nova.</w:t>
             </w:r>
           </w:p>
           <w:p>
@@ -601,7 +601,7 @@
                 <w:i w:val="0"/>
                 <w:sz w:val="19"/>
               </w:rPr>
-              <w:t>SIM ou NÃO: descansar sem produzir nada te faz sentir culpada?</w:t>
+              <w:t>E viver cobrando de si mesma um padrão impossível tem um custo alto: cansaço, adiamento, e pouca alegria pelo que já foi conquistado.</w:t>
             </w:r>
           </w:p>
           <w:p>
@@ -641,26 +641,7 @@
                 <w:i w:val="0"/>
                 <w:sz w:val="19"/>
               </w:rPr>
-              <w:t>Se você marcou três ou mais, talvez o perfeccionismo esteja funcionando mais como freio do que como impulso.</w:t>
-            </w:r>
-            <w:r>
-              <w:br/>
-            </w:r>
-            <w:r>
-              <w:rPr>
-                <w:b/>
-                <w:i w:val="0"/>
-                <w:sz w:val="19"/>
-              </w:rPr>
-              <w:t xml:space="preserve">SUBHEADLINE: </w:t>
-            </w:r>
-            <w:r>
-              <w:rPr>
-                <w:b w:val="0"/>
-                <w:i w:val="0"/>
-                <w:sz w:val="19"/>
-              </w:rPr>
-              <w:t>E isso pode ser trabalhado, sem virar mediocridade, só mais leveza.</w:t>
+              <w:t>Se você se reconheceu nessa história, talvez seja hora de entender essa raiz de verdade.</w:t>
             </w:r>
             <w:r>
               <w:br/>
@@ -679,7 +660,7 @@
                 <w:i w:val="0"/>
                 <w:sz w:val="19"/>
               </w:rPr>
-              <w:t>Se você quer aprender a fazer o suficiente sem se cobrar o impossível, comente PERFEIÇÃO, que eu vou te enviar um presente no seu direct.</w:t>
+              <w:t>Comente PERFEIÇÃO e eu te conto mais no seu direct.</w:t>
             </w:r>
           </w:p>
           <w:p>
@@ -700,7 +681,7 @@
                 <w:i w:val="0"/>
                 <w:sz w:val="19"/>
               </w:rPr>
-              <w:t>Perfeccionismo não é sinônimo de excelência, às vezes é só medo de julgamento com roupa nova. Comente PERFEIÇÃO e olha o que eu vou te enviar no seu direct.</w:t>
+              <w:t>Ela tinha feito tudo certo, e mesmo assim não conseguiu comemorar. Se essa história te lembrou de alguma coisa, comente PERFEIÇÃO e olha o que eu vou te enviar no seu direct.</w:t>
             </w:r>
           </w:p>
           <w:p>
@@ -746,7 +727,7 @@
                 <w:color w:val="9C1256"/>
                 <w:sz w:val="17"/>
               </w:rPr>
-              <w:t>Assim que postar no Instagram, repostar no grupo do WhatsApp (mesma arte e legenda).</w:t>
+              <w:t>Automação: 1ª mensagem oferece o curso (venda direta). No dia seguinte (08/08), enviar follow-up convidando para o Grupo VIP. Ver plano de automação separado.</w:t>
             </w:r>
           </w:p>
         </w:tc>
@@ -857,7 +838,7 @@
                 <w:color w:val="FFFFFF"/>
                 <w:sz w:val="20"/>
               </w:rPr>
-              <w:t>⏰ 09h   [ INSTAGRAM ]   💬 ENGAJAMENTO (Automação -&gt; Grupo VIP)</w:t>
+              <w:t>⏰ 09h   [ INSTAGRAM ]   💰 VENDA (Automação -&gt; Curso, ver plano de automação)</w:t>
             </w:r>
           </w:p>
         </w:tc>
@@ -1006,7 +987,7 @@
                 <w:color w:val="9C1256"/>
                 <w:sz w:val="17"/>
               </w:rPr>
-              <w:t>Assim que postar no Instagram, repostar no grupo do WhatsApp (mesma arte e legenda).</w:t>
+              <w:t>Automação: 1ª mensagem oferece o curso (venda direta). No dia seguinte (13/08), enviar follow-up convidando para o Grupo VIP. Ver plano de automação separado.</w:t>
             </w:r>
           </w:p>
         </w:tc>
@@ -1083,7 +1064,7 @@
                 <w:color w:val="FFFFFF"/>
                 <w:sz w:val="20"/>
               </w:rPr>
-              <w:t>⏰ 09h   [ INSTAGRAM ]   💬 ENGAJAMENTO (Automação -&gt; presente no direct)</w:t>
+              <w:t>⏰ 09h   [ INSTAGRAM ]   💰 VENDA (Automação -&gt; Curso, ver plano de automação)</w:t>
             </w:r>
           </w:p>
         </w:tc>
@@ -1278,7 +1259,7 @@
                 <w:color w:val="9C1256"/>
                 <w:sz w:val="17"/>
               </w:rPr>
-              <w:t>Assim que postar no Instagram, repostar no grupo do WhatsApp (mesmo vídeo e legenda).</w:t>
+              <w:t>Automação: 1ª mensagem oferece o curso (venda direta). No dia seguinte (15/08), enviar follow-up convidando para o Grupo VIP. Ver plano de automação separado.</w:t>
             </w:r>
           </w:p>
         </w:tc>
@@ -1572,7 +1553,7 @@
                 <w:color w:val="FFFFFF"/>
                 <w:sz w:val="21"/>
               </w:rPr>
-              <w:t>📅  21/08 (SEX), Carrossel</w:t>
+              <w:t>📅  21/08 (SEX), Carrossel narrativo</w:t>
             </w:r>
           </w:p>
         </w:tc>
@@ -1615,7 +1596,7 @@
                 <w:color w:val="FFFFFF"/>
                 <w:sz w:val="20"/>
               </w:rPr>
-              <w:t>⏰ 09h   [ INSTAGRAM ]   💬 VALOR + ENGAJAMENTO (Automação -&gt; Grupo VIP)</w:t>
+              <w:t>⏰ 09h   [ INSTAGRAM ]   💰 VENDA (Automação -&gt; Curso, ver plano de automação)</w:t>
             </w:r>
           </w:p>
         </w:tc>
@@ -1655,7 +1636,7 @@
                 <w:i w:val="0"/>
                 <w:sz w:val="18"/>
               </w:rPr>
-              <w:t>Carrossel (7 cards)</w:t>
+              <w:t>Carrossel (7 cards, narrativo)</w:t>
             </w:r>
           </w:p>
           <w:p>
@@ -1695,7 +1676,7 @@
                 <w:i w:val="0"/>
                 <w:sz w:val="19"/>
               </w:rPr>
-              <w:t>Marca SIM ou NÃO. Se bater 3 ou mais, talvez você repita mais do que imagina.</w:t>
+              <w:t>Era o terceiro relacionamento em dois anos que terminava do mesmo jeito. Cenário diferente, pessoa diferente, final idêntico.</w:t>
             </w:r>
             <w:r>
               <w:br/>
@@ -1714,7 +1695,7 @@
                 <w:i w:val="0"/>
                 <w:sz w:val="19"/>
               </w:rPr>
-              <w:t>Arrasta para o lado e vai contando.</w:t>
+              <w:t>Arrasta para o lado.</w:t>
             </w:r>
           </w:p>
           <w:p>
@@ -1746,7 +1727,7 @@
                 <w:i w:val="0"/>
                 <w:sz w:val="19"/>
               </w:rPr>
-              <w:t>SIM ou NÃO: seus últimos relacionamentos, de longe, parecem versões diferentes do mesmo problema?</w:t>
+              <w:t>No começo, ela achava que só tinha azar. Todo mundo dizia isso também: você só não encontrou a pessoa certa ainda.</w:t>
             </w:r>
           </w:p>
           <w:p>
@@ -1778,7 +1759,7 @@
                 <w:i w:val="0"/>
                 <w:sz w:val="19"/>
               </w:rPr>
-              <w:t>SIM ou NÃO: você costuma se atrair por pessoas emocionalmente indisponíveis?</w:t>
+              <w:t>Mas, olhando de fora, dava para ver um fio conectando todas as histórias: sempre a mesma dificuldade de perceber os primeiros sinais de alerta.</w:t>
             </w:r>
           </w:p>
           <w:p>
@@ -1810,7 +1791,7 @@
                 <w:i w:val="0"/>
                 <w:sz w:val="19"/>
               </w:rPr>
-              <w:t>SIM ou NÃO: você tem dificuldade de perceber sinais de alerta no início de uma relação?</w:t>
+              <w:t>E sempre a mesma sensação, no fim, de ter cuidado mais do outro do que foi cuidada.</w:t>
             </w:r>
           </w:p>
           <w:p>
@@ -1842,7 +1823,7 @@
                 <w:i w:val="0"/>
                 <w:sz w:val="19"/>
               </w:rPr>
-              <w:t>SIM ou NÃO: você já ficou mais tempo do que deveria numa relação que não te fazia bem?</w:t>
+              <w:t>Isso não é falta de sorte repetida. É um padrão, e padrões, diferente de azar, podem ser entendidos e mudados.</w:t>
             </w:r>
           </w:p>
           <w:p>
@@ -1874,7 +1855,7 @@
                 <w:i w:val="0"/>
                 <w:sz w:val="19"/>
               </w:rPr>
-              <w:t>SIM ou NÃO: você sente que sempre acaba cuidando mais do outro do que sendo cuidada?</w:t>
+              <w:t>Entender o próprio padrão não garante que o próximo relacionamento vai ser perfeito, mas muda completamente a forma de escolher, e de perceber os sinais a tempo.</w:t>
             </w:r>
           </w:p>
           <w:p>
@@ -1914,26 +1895,7 @@
                 <w:i w:val="0"/>
                 <w:sz w:val="19"/>
               </w:rPr>
-              <w:t>Se você marcou três ou mais, talvez exista um padrão se repetindo, não uma sequência de azar.</w:t>
-            </w:r>
-            <w:r>
-              <w:br/>
-            </w:r>
-            <w:r>
-              <w:rPr>
-                <w:b/>
-                <w:i w:val="0"/>
-                <w:sz w:val="19"/>
-              </w:rPr>
-              <w:t xml:space="preserve">SUBHEADLINE: </w:t>
-            </w:r>
-            <w:r>
-              <w:rPr>
-                <w:b w:val="0"/>
-                <w:i w:val="0"/>
-                <w:sz w:val="19"/>
-              </w:rPr>
-              <w:t>E padrões, diferente de azar, podem ser entendidos e mudados.</w:t>
+              <w:t>Se alguma parte dessa história parece familiar, talvez valha a pena entender qual é o seu padrão.</w:t>
             </w:r>
             <w:r>
               <w:br/>
@@ -1952,7 +1914,7 @@
                 <w:i w:val="0"/>
                 <w:sz w:val="19"/>
               </w:rPr>
-              <w:t>Se você quer entender qual é o seu, comente PADRÕES, que eu vou te enviar um presente no seu direct.</w:t>
+              <w:t>Comente PADRÕES e eu te conto mais no seu direct.</w:t>
             </w:r>
           </w:p>
           <w:p>
@@ -2019,7 +1981,7 @@
                 <w:color w:val="9C1256"/>
                 <w:sz w:val="17"/>
               </w:rPr>
-              <w:t>Assim que postar no Instagram, repostar no grupo do WhatsApp (mesma arte e legenda).</w:t>
+              <w:t>Automação: 1ª mensagem oferece o curso (venda direta). No dia seguinte (22/08), enviar follow-up convidando para o Grupo VIP. Ver plano de automação separado.</w:t>
             </w:r>
           </w:p>
         </w:tc>
@@ -2356,7 +2318,7 @@
                 <w:color w:val="FFFFFF"/>
                 <w:sz w:val="20"/>
               </w:rPr>
-              <w:t>⏰ 09h   [ INSTAGRAM ]   💬 ENGAJAMENTO (Automação -&gt; presente no direct)</w:t>
+              <w:t>⏰ 09h   [ INSTAGRAM ]   💰 VENDA (Automação -&gt; Curso, ver plano de automação)</w:t>
             </w:r>
           </w:p>
         </w:tc>
@@ -2551,7 +2513,7 @@
                 <w:color w:val="9C1256"/>
                 <w:sz w:val="17"/>
               </w:rPr>
-              <w:t>Assim que postar no Instagram, repostar no grupo do WhatsApp (mesmo vídeo e legenda). Fecha o mês de agosto, bom gancho para setembro.</w:t>
+              <w:t>Automação: 1ª mensagem oferece o curso (venda direta). No dia seguinte (29/08), enviar follow-up convidando para o Grupo VIP. Fecha o mês, bom gancho para setembro. Ver plano de automação separado.</w:t>
             </w:r>
           </w:p>
         </w:tc>

</xml_diff>

<commit_message>
Reformata roteiros de reels em blocos de teleprompter e renomeia publico do grupo para "donas de si"
Roteiros de reels (14/08, 28/08, 31/07) agora sao renderizados em caixinhas
por trecho, igual aos carrosseis, facilitando a leitura da Camila durante
a gravacao. Textos de chamada do WhatsApp (julho e agosto) trocam
"mulheres" por "donas de si", termo escolhido pela Camila para as
integrantes da Comunidade AME-SE.

Co-Authored-By: Claude Sonnet 5 <noreply@anthropic.com>
</commit_message>
<xml_diff>
--- a/camila-sartori/calendario-fonte/calendario-instagram-agosto.docx
+++ b/camila-sartori/calendario-fonte/calendario-instagram-agosto.docx
@@ -1158,10 +1158,43 @@
             <w:r>
               <w:rPr>
                 <w:b/>
+                <w:i/>
+                <w:color w:val="666666"/>
+                <w:sz w:val="17"/>
+              </w:rPr>
+              <w:t xml:space="preserve">ROTEIRO (teleprompter): </w:t>
+            </w:r>
+            <w:r>
+              <w:rPr>
+                <w:b w:val="0"/>
+                <w:i/>
+                <w:color w:val="666666"/>
+                <w:sz w:val="17"/>
+              </w:rPr>
+            </w:r>
+          </w:p>
+          <w:p>
+            <w:pPr>
+              <w:spacing w:after="160" w:before="40"/>
+              <w:shd w:val="clear" w:fill="FBEEF7"/>
+              <w:pBdr>
+                <w:top w:val="single" w:sz="6" w:space="4" w:color="D9D9D9"/>
+                <w:left w:val="single" w:sz="6" w:space="4" w:color="D9D9D9"/>
+                <w:bottom w:val="single" w:sz="6" w:space="4" w:color="D9D9D9"/>
+                <w:right w:val="single" w:sz="6" w:space="4" w:color="D9D9D9"/>
+              </w:pBdr>
+            </w:pPr>
+            <w:r>
+              <w:rPr>
+                <w:b/>
                 <w:i w:val="0"/>
-                <w:sz w:val="19"/>
+                <w:color w:val="666666"/>
+                <w:sz w:val="18"/>
               </w:rPr>
-              <w:t xml:space="preserve">SUBHEADLINE: </w:t>
+              <w:t>TRECHO 1</w:t>
+            </w:r>
+            <w:r>
+              <w:br/>
             </w:r>
             <w:r>
               <w:rPr>
@@ -1169,7 +1202,359 @@
                 <w:i w:val="0"/>
                 <w:sz w:val="19"/>
               </w:rPr>
-              <w:t>Roteiro completo: "Vou compartilhar com você o caso da Maria. Ela sabia listar de cabeça cinco coisas que fez de errado essa semana. Mas se alguém pedisse para ela listar cinco coisas que fez de bom, ela nem sequer lembrava. Isso porque, desde muito cedo, Maria aprendeu a prestar atenção no que faltava, não no que já tinha dado certo. E isso não tem nada a ver com modéstia, é um hábito que ela aprendeu, provavelmente desde a infância. Hábito é um tipo de condicionamento que a mente se acostuma, e do mesmo jeito que ela foi treinada para repetir esse padrão, também consegue se desvincular dele, como qualquer músculo do corpo. O problema é que Maria nunca tinha parado para avaliar se era possível mudar esse hábito. Ela tinha o costume de confundir exigência com excelência, e autocrítica com humildade, e foi vivendo assim, sempre um passo atrás de se sentir suficiente. Nada que ela fizesse era bom o bastante, mesmo revisando tudo, terminando antes do prazo, fazendo certo. Para os outros, estava ótimo. Para ela, nunca era suficiente. Você se sentiu identificada com a Maria em algum ponto? Pois é, isso pode ser um indício de que talvez você seja uma pessoa perfeccionista, e isso pode estar drenando a sua energia, e te impedindo de sentir tranquilidade e orgulho por cada coisa que você faz. Eu sou Camila Sartori, psicóloga há quase dez anos, mestre em Psicologia Clínica e atualmente doutoranda, e no meu consultório vejo isso quase toda semana: mulheres brilhantes e competentes que não conseguem enxergar o próprio valor, porque nunca aprenderam a olhar para ele. Se você quer quebrar esse padrão de uma vez por todas, comente AUTOESTIMA e eu vou te enviar um presente no seu direct."</w:t>
+              <w:t>Vou compartilhar com você o caso da Maria. Ela sabia listar de cabeça cinco coisas que fez de errado essa semana.</w:t>
+            </w:r>
+          </w:p>
+          <w:p>
+            <w:pPr>
+              <w:spacing w:after="160" w:before="40"/>
+              <w:shd w:val="clear" w:fill="FBEEF7"/>
+              <w:pBdr>
+                <w:top w:val="single" w:sz="6" w:space="4" w:color="D9D9D9"/>
+                <w:left w:val="single" w:sz="6" w:space="4" w:color="D9D9D9"/>
+                <w:bottom w:val="single" w:sz="6" w:space="4" w:color="D9D9D9"/>
+                <w:right w:val="single" w:sz="6" w:space="4" w:color="D9D9D9"/>
+              </w:pBdr>
+            </w:pPr>
+            <w:r>
+              <w:rPr>
+                <w:b/>
+                <w:i w:val="0"/>
+                <w:color w:val="666666"/>
+                <w:sz w:val="18"/>
+              </w:rPr>
+              <w:t>TRECHO 2</w:t>
+            </w:r>
+            <w:r>
+              <w:br/>
+            </w:r>
+            <w:r>
+              <w:rPr>
+                <w:b w:val="0"/>
+                <w:i w:val="0"/>
+                <w:sz w:val="19"/>
+              </w:rPr>
+              <w:t>Mas se alguém pedisse para ela listar cinco coisas que fez de bom, ela nem sequer lembrava.</w:t>
+            </w:r>
+          </w:p>
+          <w:p>
+            <w:pPr>
+              <w:spacing w:after="160" w:before="40"/>
+              <w:shd w:val="clear" w:fill="FBEEF7"/>
+              <w:pBdr>
+                <w:top w:val="single" w:sz="6" w:space="4" w:color="D9D9D9"/>
+                <w:left w:val="single" w:sz="6" w:space="4" w:color="D9D9D9"/>
+                <w:bottom w:val="single" w:sz="6" w:space="4" w:color="D9D9D9"/>
+                <w:right w:val="single" w:sz="6" w:space="4" w:color="D9D9D9"/>
+              </w:pBdr>
+            </w:pPr>
+            <w:r>
+              <w:rPr>
+                <w:b/>
+                <w:i w:val="0"/>
+                <w:color w:val="666666"/>
+                <w:sz w:val="18"/>
+              </w:rPr>
+              <w:t>TRECHO 3</w:t>
+            </w:r>
+            <w:r>
+              <w:br/>
+            </w:r>
+            <w:r>
+              <w:rPr>
+                <w:b w:val="0"/>
+                <w:i w:val="0"/>
+                <w:sz w:val="19"/>
+              </w:rPr>
+              <w:t>Isso porque, desde muito cedo, Maria aprendeu a prestar atenção no que faltava, não no que já tinha dado certo.</w:t>
+            </w:r>
+          </w:p>
+          <w:p>
+            <w:pPr>
+              <w:spacing w:after="160" w:before="40"/>
+              <w:shd w:val="clear" w:fill="FBEEF7"/>
+              <w:pBdr>
+                <w:top w:val="single" w:sz="6" w:space="4" w:color="D9D9D9"/>
+                <w:left w:val="single" w:sz="6" w:space="4" w:color="D9D9D9"/>
+                <w:bottom w:val="single" w:sz="6" w:space="4" w:color="D9D9D9"/>
+                <w:right w:val="single" w:sz="6" w:space="4" w:color="D9D9D9"/>
+              </w:pBdr>
+            </w:pPr>
+            <w:r>
+              <w:rPr>
+                <w:b/>
+                <w:i w:val="0"/>
+                <w:color w:val="666666"/>
+                <w:sz w:val="18"/>
+              </w:rPr>
+              <w:t>TRECHO 4</w:t>
+            </w:r>
+            <w:r>
+              <w:br/>
+            </w:r>
+            <w:r>
+              <w:rPr>
+                <w:b w:val="0"/>
+                <w:i w:val="0"/>
+                <w:sz w:val="19"/>
+              </w:rPr>
+              <w:t>E isso não tem nada a ver com modéstia, é um hábito que ela aprendeu, provavelmente desde a infância.</w:t>
+            </w:r>
+          </w:p>
+          <w:p>
+            <w:pPr>
+              <w:spacing w:after="160" w:before="40"/>
+              <w:shd w:val="clear" w:fill="FBEEF7"/>
+              <w:pBdr>
+                <w:top w:val="single" w:sz="6" w:space="4" w:color="D9D9D9"/>
+                <w:left w:val="single" w:sz="6" w:space="4" w:color="D9D9D9"/>
+                <w:bottom w:val="single" w:sz="6" w:space="4" w:color="D9D9D9"/>
+                <w:right w:val="single" w:sz="6" w:space="4" w:color="D9D9D9"/>
+              </w:pBdr>
+            </w:pPr>
+            <w:r>
+              <w:rPr>
+                <w:b/>
+                <w:i w:val="0"/>
+                <w:color w:val="666666"/>
+                <w:sz w:val="18"/>
+              </w:rPr>
+              <w:t>TRECHO 5</w:t>
+            </w:r>
+            <w:r>
+              <w:br/>
+            </w:r>
+            <w:r>
+              <w:rPr>
+                <w:b w:val="0"/>
+                <w:i w:val="0"/>
+                <w:sz w:val="19"/>
+              </w:rPr>
+              <w:t>Hábito é um tipo de condicionamento que a mente se acostuma, e do mesmo jeito que ela foi treinada para repetir esse padrão, também consegue se desvincular dele, como qualquer músculo do corpo.</w:t>
+            </w:r>
+          </w:p>
+          <w:p>
+            <w:pPr>
+              <w:spacing w:after="160" w:before="40"/>
+              <w:shd w:val="clear" w:fill="FBEEF7"/>
+              <w:pBdr>
+                <w:top w:val="single" w:sz="6" w:space="4" w:color="D9D9D9"/>
+                <w:left w:val="single" w:sz="6" w:space="4" w:color="D9D9D9"/>
+                <w:bottom w:val="single" w:sz="6" w:space="4" w:color="D9D9D9"/>
+                <w:right w:val="single" w:sz="6" w:space="4" w:color="D9D9D9"/>
+              </w:pBdr>
+            </w:pPr>
+            <w:r>
+              <w:rPr>
+                <w:b/>
+                <w:i w:val="0"/>
+                <w:color w:val="666666"/>
+                <w:sz w:val="18"/>
+              </w:rPr>
+              <w:t>TRECHO 6</w:t>
+            </w:r>
+            <w:r>
+              <w:br/>
+            </w:r>
+            <w:r>
+              <w:rPr>
+                <w:b w:val="0"/>
+                <w:i w:val="0"/>
+                <w:sz w:val="19"/>
+              </w:rPr>
+              <w:t>O problema é que Maria nunca tinha parado para avaliar se era possível mudar esse hábito.</w:t>
+            </w:r>
+          </w:p>
+          <w:p>
+            <w:pPr>
+              <w:spacing w:after="160" w:before="40"/>
+              <w:shd w:val="clear" w:fill="FBEEF7"/>
+              <w:pBdr>
+                <w:top w:val="single" w:sz="6" w:space="4" w:color="D9D9D9"/>
+                <w:left w:val="single" w:sz="6" w:space="4" w:color="D9D9D9"/>
+                <w:bottom w:val="single" w:sz="6" w:space="4" w:color="D9D9D9"/>
+                <w:right w:val="single" w:sz="6" w:space="4" w:color="D9D9D9"/>
+              </w:pBdr>
+            </w:pPr>
+            <w:r>
+              <w:rPr>
+                <w:b/>
+                <w:i w:val="0"/>
+                <w:color w:val="666666"/>
+                <w:sz w:val="18"/>
+              </w:rPr>
+              <w:t>TRECHO 7</w:t>
+            </w:r>
+            <w:r>
+              <w:br/>
+            </w:r>
+            <w:r>
+              <w:rPr>
+                <w:b w:val="0"/>
+                <w:i w:val="0"/>
+                <w:sz w:val="19"/>
+              </w:rPr>
+              <w:t>Ela tinha o costume de confundir exigência com excelência, e autocrítica com humildade, e foi vivendo assim, sempre um passo atrás de se sentir suficiente.</w:t>
+            </w:r>
+          </w:p>
+          <w:p>
+            <w:pPr>
+              <w:spacing w:after="160" w:before="40"/>
+              <w:shd w:val="clear" w:fill="FBEEF7"/>
+              <w:pBdr>
+                <w:top w:val="single" w:sz="6" w:space="4" w:color="D9D9D9"/>
+                <w:left w:val="single" w:sz="6" w:space="4" w:color="D9D9D9"/>
+                <w:bottom w:val="single" w:sz="6" w:space="4" w:color="D9D9D9"/>
+                <w:right w:val="single" w:sz="6" w:space="4" w:color="D9D9D9"/>
+              </w:pBdr>
+            </w:pPr>
+            <w:r>
+              <w:rPr>
+                <w:b/>
+                <w:i w:val="0"/>
+                <w:color w:val="666666"/>
+                <w:sz w:val="18"/>
+              </w:rPr>
+              <w:t>TRECHO 8</w:t>
+            </w:r>
+            <w:r>
+              <w:br/>
+            </w:r>
+            <w:r>
+              <w:rPr>
+                <w:b w:val="0"/>
+                <w:i w:val="0"/>
+                <w:sz w:val="19"/>
+              </w:rPr>
+              <w:t>Nada que ela fizesse era bom o bastante, mesmo revisando tudo, terminando antes do prazo, fazendo certo. Para os outros, estava ótimo. Para ela, nunca era suficiente.</w:t>
+            </w:r>
+          </w:p>
+          <w:p>
+            <w:pPr>
+              <w:spacing w:after="160" w:before="40"/>
+              <w:shd w:val="clear" w:fill="FBEEF7"/>
+              <w:pBdr>
+                <w:top w:val="single" w:sz="6" w:space="4" w:color="D9D9D9"/>
+                <w:left w:val="single" w:sz="6" w:space="4" w:color="D9D9D9"/>
+                <w:bottom w:val="single" w:sz="6" w:space="4" w:color="D9D9D9"/>
+                <w:right w:val="single" w:sz="6" w:space="4" w:color="D9D9D9"/>
+              </w:pBdr>
+            </w:pPr>
+            <w:r>
+              <w:rPr>
+                <w:b/>
+                <w:i w:val="0"/>
+                <w:color w:val="666666"/>
+                <w:sz w:val="18"/>
+              </w:rPr>
+              <w:t>TRECHO 9</w:t>
+            </w:r>
+            <w:r>
+              <w:br/>
+            </w:r>
+            <w:r>
+              <w:rPr>
+                <w:b w:val="0"/>
+                <w:i w:val="0"/>
+                <w:sz w:val="19"/>
+              </w:rPr>
+              <w:t>Você se sentiu identificada com a Maria em algum ponto?</w:t>
+            </w:r>
+          </w:p>
+          <w:p>
+            <w:pPr>
+              <w:spacing w:after="160" w:before="40"/>
+              <w:shd w:val="clear" w:fill="FBEEF7"/>
+              <w:pBdr>
+                <w:top w:val="single" w:sz="6" w:space="4" w:color="D9D9D9"/>
+                <w:left w:val="single" w:sz="6" w:space="4" w:color="D9D9D9"/>
+                <w:bottom w:val="single" w:sz="6" w:space="4" w:color="D9D9D9"/>
+                <w:right w:val="single" w:sz="6" w:space="4" w:color="D9D9D9"/>
+              </w:pBdr>
+            </w:pPr>
+            <w:r>
+              <w:rPr>
+                <w:b/>
+                <w:i w:val="0"/>
+                <w:color w:val="666666"/>
+                <w:sz w:val="18"/>
+              </w:rPr>
+              <w:t>TRECHO 10</w:t>
+            </w:r>
+            <w:r>
+              <w:br/>
+            </w:r>
+            <w:r>
+              <w:rPr>
+                <w:b w:val="0"/>
+                <w:i w:val="0"/>
+                <w:sz w:val="19"/>
+              </w:rPr>
+              <w:t>Pois é, isso pode ser um indício de que talvez você seja uma pessoa perfeccionista, e isso pode estar drenando a sua energia, e te impedindo de sentir tranquilidade e orgulho por cada coisa que você faz.</w:t>
+            </w:r>
+          </w:p>
+          <w:p>
+            <w:pPr>
+              <w:spacing w:after="160" w:before="40"/>
+              <w:shd w:val="clear" w:fill="FBEEF7"/>
+              <w:pBdr>
+                <w:top w:val="single" w:sz="6" w:space="4" w:color="D9D9D9"/>
+                <w:left w:val="single" w:sz="6" w:space="4" w:color="D9D9D9"/>
+                <w:bottom w:val="single" w:sz="6" w:space="4" w:color="D9D9D9"/>
+                <w:right w:val="single" w:sz="6" w:space="4" w:color="D9D9D9"/>
+              </w:pBdr>
+            </w:pPr>
+            <w:r>
+              <w:rPr>
+                <w:b/>
+                <w:i w:val="0"/>
+                <w:color w:val="666666"/>
+                <w:sz w:val="18"/>
+              </w:rPr>
+              <w:t>TRECHO 11</w:t>
+            </w:r>
+            <w:r>
+              <w:br/>
+            </w:r>
+            <w:r>
+              <w:rPr>
+                <w:b w:val="0"/>
+                <w:i w:val="0"/>
+                <w:sz w:val="19"/>
+              </w:rPr>
+              <w:t>Eu sou Camila Sartori, psicóloga há quase dez anos, mestre em Psicologia Clínica e atualmente doutoranda, e no meu consultório vejo isso quase toda semana: mulheres brilhantes e competentes que não conseguem enxergar o próprio valor, porque nunca aprenderam a olhar para ele.</w:t>
+            </w:r>
+          </w:p>
+          <w:p>
+            <w:pPr>
+              <w:spacing w:after="160" w:before="40"/>
+              <w:shd w:val="clear" w:fill="FBEEF7"/>
+              <w:pBdr>
+                <w:top w:val="single" w:sz="6" w:space="4" w:color="D9D9D9"/>
+                <w:left w:val="single" w:sz="6" w:space="4" w:color="D9D9D9"/>
+                <w:bottom w:val="single" w:sz="6" w:space="4" w:color="D9D9D9"/>
+                <w:right w:val="single" w:sz="6" w:space="4" w:color="D9D9D9"/>
+              </w:pBdr>
+            </w:pPr>
+            <w:r>
+              <w:rPr>
+                <w:b/>
+                <w:i w:val="0"/>
+                <w:color w:val="666666"/>
+                <w:sz w:val="18"/>
+              </w:rPr>
+              <w:t>TRECHO 12</w:t>
+            </w:r>
+            <w:r>
+              <w:br/>
+            </w:r>
+            <w:r>
+              <w:rPr>
+                <w:b w:val="0"/>
+                <w:i w:val="0"/>
+                <w:sz w:val="19"/>
+              </w:rPr>
+              <w:t>Se você quer quebrar esse padrão de uma vez por todas, comente AUTOESTIMA e eu vou te enviar um presente no seu direct.</w:t>
             </w:r>
           </w:p>
           <w:p>
@@ -2412,10 +2797,43 @@
             <w:r>
               <w:rPr>
                 <w:b/>
+                <w:i/>
+                <w:color w:val="666666"/>
+                <w:sz w:val="17"/>
+              </w:rPr>
+              <w:t xml:space="preserve">ROTEIRO (teleprompter): </w:t>
+            </w:r>
+            <w:r>
+              <w:rPr>
+                <w:b w:val="0"/>
+                <w:i/>
+                <w:color w:val="666666"/>
+                <w:sz w:val="17"/>
+              </w:rPr>
+            </w:r>
+          </w:p>
+          <w:p>
+            <w:pPr>
+              <w:spacing w:after="160" w:before="40"/>
+              <w:shd w:val="clear" w:fill="FBEEF7"/>
+              <w:pBdr>
+                <w:top w:val="single" w:sz="6" w:space="4" w:color="D9D9D9"/>
+                <w:left w:val="single" w:sz="6" w:space="4" w:color="D9D9D9"/>
+                <w:bottom w:val="single" w:sz="6" w:space="4" w:color="D9D9D9"/>
+                <w:right w:val="single" w:sz="6" w:space="4" w:color="D9D9D9"/>
+              </w:pBdr>
+            </w:pPr>
+            <w:r>
+              <w:rPr>
+                <w:b/>
                 <w:i w:val="0"/>
-                <w:sz w:val="19"/>
+                <w:color w:val="666666"/>
+                <w:sz w:val="18"/>
               </w:rPr>
-              <w:t xml:space="preserve">SUBHEADLINE: </w:t>
+              <w:t>TRECHO 1</w:t>
+            </w:r>
+            <w:r>
+              <w:br/>
             </w:r>
             <w:r>
               <w:rPr>
@@ -2423,7 +2841,295 @@
                 <w:i w:val="0"/>
                 <w:sz w:val="19"/>
               </w:rPr>
-              <w:t>Roteiro completo: "Um padrão que eu escuto sempre no consultório, e que achei importante trazer aqui para o Instagram, é o de colocar todo mundo como prioridade e se colocar no último lugar, ou como nenhuma prioridade, na própria vida. E o pior: muitas dessas mulheres, quando param para descansar ou se cuidar, ainda sentem culpa. Culpa de descansar, culpa de se cuidar. Adiam o que importa por medo do resultado. Buscam a perfeição para tentar merecer o próprio descanso. Confundem controle com cuidado. Não conseguem listar as próprias qualidades com a mesma facilidade que listam os próprios erros. Repetem os mesmos relacionamentos, os mesmos padrões, com roupagens diferentes. E tendem a se anular para não incomodar. Nenhum desses padrões nasce do nada, gente. Cada pessoa aprendeu esse tipo de padrão, ou crença limitante, como eu costumo chamar, em algum momento da vida, como na infância, através de alguma experiência que acabou sendo reforçada como forma de proteção. Só que esses padrões podem ser desaprendidos da mesma forma que foram aprendidos. Podem ser quebrados com tempo, entendimento, conhecimento e o acompanhamento certo. Eu sou Camila Sartori, psicóloga há quase dez anos, mestre em Psicologia Clínica e atualmente doutoranda. E eu te pergunto agora: algum desses pontos que eu citei, você se identificou? Se sim, talvez seja hora de quebrar esses padrões e ter mais qualidade de vida e relacionamentos mais saudáveis. Se você deseja resolver isso de uma vez por todas, comente MUDANÇA e eu vou te enviar no seu direct."</w:t>
+              <w:t>Um padrão que eu escuto sempre no consultório, e que achei importante trazer aqui para o Instagram, é o de colocar todo mundo como prioridade e se colocar no último lugar, ou como nenhuma prioridade, na própria vida.</w:t>
+            </w:r>
+          </w:p>
+          <w:p>
+            <w:pPr>
+              <w:spacing w:after="160" w:before="40"/>
+              <w:shd w:val="clear" w:fill="FBEEF7"/>
+              <w:pBdr>
+                <w:top w:val="single" w:sz="6" w:space="4" w:color="D9D9D9"/>
+                <w:left w:val="single" w:sz="6" w:space="4" w:color="D9D9D9"/>
+                <w:bottom w:val="single" w:sz="6" w:space="4" w:color="D9D9D9"/>
+                <w:right w:val="single" w:sz="6" w:space="4" w:color="D9D9D9"/>
+              </w:pBdr>
+            </w:pPr>
+            <w:r>
+              <w:rPr>
+                <w:b/>
+                <w:i w:val="0"/>
+                <w:color w:val="666666"/>
+                <w:sz w:val="18"/>
+              </w:rPr>
+              <w:t>TRECHO 2</w:t>
+            </w:r>
+            <w:r>
+              <w:br/>
+            </w:r>
+            <w:r>
+              <w:rPr>
+                <w:b w:val="0"/>
+                <w:i w:val="0"/>
+                <w:sz w:val="19"/>
+              </w:rPr>
+              <w:t>E o pior: muitas dessas mulheres, quando param para descansar ou se cuidar, ainda sentem culpa. Culpa de descansar, culpa de se cuidar.</w:t>
+            </w:r>
+          </w:p>
+          <w:p>
+            <w:pPr>
+              <w:spacing w:after="160" w:before="40"/>
+              <w:shd w:val="clear" w:fill="FBEEF7"/>
+              <w:pBdr>
+                <w:top w:val="single" w:sz="6" w:space="4" w:color="D9D9D9"/>
+                <w:left w:val="single" w:sz="6" w:space="4" w:color="D9D9D9"/>
+                <w:bottom w:val="single" w:sz="6" w:space="4" w:color="D9D9D9"/>
+                <w:right w:val="single" w:sz="6" w:space="4" w:color="D9D9D9"/>
+              </w:pBdr>
+            </w:pPr>
+            <w:r>
+              <w:rPr>
+                <w:b/>
+                <w:i w:val="0"/>
+                <w:color w:val="666666"/>
+                <w:sz w:val="18"/>
+              </w:rPr>
+              <w:t>TRECHO 3</w:t>
+            </w:r>
+            <w:r>
+              <w:br/>
+            </w:r>
+            <w:r>
+              <w:rPr>
+                <w:b w:val="0"/>
+                <w:i w:val="0"/>
+                <w:sz w:val="19"/>
+              </w:rPr>
+              <w:t>Adiam o que importa por medo do resultado. Buscam a perfeição para tentar merecer o próprio descanso. Confundem controle com cuidado.</w:t>
+            </w:r>
+          </w:p>
+          <w:p>
+            <w:pPr>
+              <w:spacing w:after="160" w:before="40"/>
+              <w:shd w:val="clear" w:fill="FBEEF7"/>
+              <w:pBdr>
+                <w:top w:val="single" w:sz="6" w:space="4" w:color="D9D9D9"/>
+                <w:left w:val="single" w:sz="6" w:space="4" w:color="D9D9D9"/>
+                <w:bottom w:val="single" w:sz="6" w:space="4" w:color="D9D9D9"/>
+                <w:right w:val="single" w:sz="6" w:space="4" w:color="D9D9D9"/>
+              </w:pBdr>
+            </w:pPr>
+            <w:r>
+              <w:rPr>
+                <w:b/>
+                <w:i w:val="0"/>
+                <w:color w:val="666666"/>
+                <w:sz w:val="18"/>
+              </w:rPr>
+              <w:t>TRECHO 4</w:t>
+            </w:r>
+            <w:r>
+              <w:br/>
+            </w:r>
+            <w:r>
+              <w:rPr>
+                <w:b w:val="0"/>
+                <w:i w:val="0"/>
+                <w:sz w:val="19"/>
+              </w:rPr>
+              <w:t>Não conseguem listar as próprias qualidades com a mesma facilidade que listam os próprios erros. Repetem os mesmos relacionamentos, os mesmos padrões, com roupagens diferentes. E tendem a se anular para não incomodar.</w:t>
+            </w:r>
+          </w:p>
+          <w:p>
+            <w:pPr>
+              <w:spacing w:after="160" w:before="40"/>
+              <w:shd w:val="clear" w:fill="FBEEF7"/>
+              <w:pBdr>
+                <w:top w:val="single" w:sz="6" w:space="4" w:color="D9D9D9"/>
+                <w:left w:val="single" w:sz="6" w:space="4" w:color="D9D9D9"/>
+                <w:bottom w:val="single" w:sz="6" w:space="4" w:color="D9D9D9"/>
+                <w:right w:val="single" w:sz="6" w:space="4" w:color="D9D9D9"/>
+              </w:pBdr>
+            </w:pPr>
+            <w:r>
+              <w:rPr>
+                <w:b/>
+                <w:i w:val="0"/>
+                <w:color w:val="666666"/>
+                <w:sz w:val="18"/>
+              </w:rPr>
+              <w:t>TRECHO 5</w:t>
+            </w:r>
+            <w:r>
+              <w:br/>
+            </w:r>
+            <w:r>
+              <w:rPr>
+                <w:b w:val="0"/>
+                <w:i w:val="0"/>
+                <w:sz w:val="19"/>
+              </w:rPr>
+              <w:t>Nenhum desses padrões nasce do nada, gente. Cada pessoa aprendeu esse tipo de padrão, ou crença limitante, como eu costumo chamar, em algum momento da vida, como na infância, através de alguma experiência que acabou sendo reforçada como forma de proteção.</w:t>
+            </w:r>
+          </w:p>
+          <w:p>
+            <w:pPr>
+              <w:spacing w:after="160" w:before="40"/>
+              <w:shd w:val="clear" w:fill="FBEEF7"/>
+              <w:pBdr>
+                <w:top w:val="single" w:sz="6" w:space="4" w:color="D9D9D9"/>
+                <w:left w:val="single" w:sz="6" w:space="4" w:color="D9D9D9"/>
+                <w:bottom w:val="single" w:sz="6" w:space="4" w:color="D9D9D9"/>
+                <w:right w:val="single" w:sz="6" w:space="4" w:color="D9D9D9"/>
+              </w:pBdr>
+            </w:pPr>
+            <w:r>
+              <w:rPr>
+                <w:b/>
+                <w:i w:val="0"/>
+                <w:color w:val="666666"/>
+                <w:sz w:val="18"/>
+              </w:rPr>
+              <w:t>TRECHO 6</w:t>
+            </w:r>
+            <w:r>
+              <w:br/>
+            </w:r>
+            <w:r>
+              <w:rPr>
+                <w:b w:val="0"/>
+                <w:i w:val="0"/>
+                <w:sz w:val="19"/>
+              </w:rPr>
+              <w:t>Só que esses padrões podem ser desaprendidos da mesma forma que foram aprendidos. Podem ser quebrados com tempo, entendimento, conhecimento e o acompanhamento certo.</w:t>
+            </w:r>
+          </w:p>
+          <w:p>
+            <w:pPr>
+              <w:spacing w:after="160" w:before="40"/>
+              <w:shd w:val="clear" w:fill="FBEEF7"/>
+              <w:pBdr>
+                <w:top w:val="single" w:sz="6" w:space="4" w:color="D9D9D9"/>
+                <w:left w:val="single" w:sz="6" w:space="4" w:color="D9D9D9"/>
+                <w:bottom w:val="single" w:sz="6" w:space="4" w:color="D9D9D9"/>
+                <w:right w:val="single" w:sz="6" w:space="4" w:color="D9D9D9"/>
+              </w:pBdr>
+            </w:pPr>
+            <w:r>
+              <w:rPr>
+                <w:b/>
+                <w:i w:val="0"/>
+                <w:color w:val="666666"/>
+                <w:sz w:val="18"/>
+              </w:rPr>
+              <w:t>TRECHO 7</w:t>
+            </w:r>
+            <w:r>
+              <w:br/>
+            </w:r>
+            <w:r>
+              <w:rPr>
+                <w:b w:val="0"/>
+                <w:i w:val="0"/>
+                <w:sz w:val="19"/>
+              </w:rPr>
+              <w:t>Eu sou Camila Sartori, psicóloga há quase dez anos, mestre em Psicologia Clínica e atualmente doutoranda.</w:t>
+            </w:r>
+          </w:p>
+          <w:p>
+            <w:pPr>
+              <w:spacing w:after="160" w:before="40"/>
+              <w:shd w:val="clear" w:fill="FBEEF7"/>
+              <w:pBdr>
+                <w:top w:val="single" w:sz="6" w:space="4" w:color="D9D9D9"/>
+                <w:left w:val="single" w:sz="6" w:space="4" w:color="D9D9D9"/>
+                <w:bottom w:val="single" w:sz="6" w:space="4" w:color="D9D9D9"/>
+                <w:right w:val="single" w:sz="6" w:space="4" w:color="D9D9D9"/>
+              </w:pBdr>
+            </w:pPr>
+            <w:r>
+              <w:rPr>
+                <w:b/>
+                <w:i w:val="0"/>
+                <w:color w:val="666666"/>
+                <w:sz w:val="18"/>
+              </w:rPr>
+              <w:t>TRECHO 8</w:t>
+            </w:r>
+            <w:r>
+              <w:br/>
+            </w:r>
+            <w:r>
+              <w:rPr>
+                <w:b w:val="0"/>
+                <w:i w:val="0"/>
+                <w:sz w:val="19"/>
+              </w:rPr>
+              <w:t>E eu te pergunto agora: algum desses pontos que eu citei, você se identificou?</w:t>
+            </w:r>
+          </w:p>
+          <w:p>
+            <w:pPr>
+              <w:spacing w:after="160" w:before="40"/>
+              <w:shd w:val="clear" w:fill="FBEEF7"/>
+              <w:pBdr>
+                <w:top w:val="single" w:sz="6" w:space="4" w:color="D9D9D9"/>
+                <w:left w:val="single" w:sz="6" w:space="4" w:color="D9D9D9"/>
+                <w:bottom w:val="single" w:sz="6" w:space="4" w:color="D9D9D9"/>
+                <w:right w:val="single" w:sz="6" w:space="4" w:color="D9D9D9"/>
+              </w:pBdr>
+            </w:pPr>
+            <w:r>
+              <w:rPr>
+                <w:b/>
+                <w:i w:val="0"/>
+                <w:color w:val="666666"/>
+                <w:sz w:val="18"/>
+              </w:rPr>
+              <w:t>TRECHO 9</w:t>
+            </w:r>
+            <w:r>
+              <w:br/>
+            </w:r>
+            <w:r>
+              <w:rPr>
+                <w:b w:val="0"/>
+                <w:i w:val="0"/>
+                <w:sz w:val="19"/>
+              </w:rPr>
+              <w:t>Se sim, talvez seja hora de quebrar esses padrões e ter mais qualidade de vida e relacionamentos mais saudáveis.</w:t>
+            </w:r>
+          </w:p>
+          <w:p>
+            <w:pPr>
+              <w:spacing w:after="160" w:before="40"/>
+              <w:shd w:val="clear" w:fill="FBEEF7"/>
+              <w:pBdr>
+                <w:top w:val="single" w:sz="6" w:space="4" w:color="D9D9D9"/>
+                <w:left w:val="single" w:sz="6" w:space="4" w:color="D9D9D9"/>
+                <w:bottom w:val="single" w:sz="6" w:space="4" w:color="D9D9D9"/>
+                <w:right w:val="single" w:sz="6" w:space="4" w:color="D9D9D9"/>
+              </w:pBdr>
+            </w:pPr>
+            <w:r>
+              <w:rPr>
+                <w:b/>
+                <w:i w:val="0"/>
+                <w:color w:val="666666"/>
+                <w:sz w:val="18"/>
+              </w:rPr>
+              <w:t>TRECHO 10</w:t>
+            </w:r>
+            <w:r>
+              <w:br/>
+            </w:r>
+            <w:r>
+              <w:rPr>
+                <w:b w:val="0"/>
+                <w:i w:val="0"/>
+                <w:sz w:val="19"/>
+              </w:rPr>
+              <w:t>Se você deseja resolver isso de uma vez por todas, comente MUDANÇA e eu vou te enviar no seu direct.</w:t>
             </w:r>
           </w:p>
           <w:p>

</xml_diff>